<commit_message>
docs: 初稿III docx 轉換 + 表6-10 XGB數據 + 表6-11刪除重編號
- Ch6: 表6-10 補 XGB Top1/Top2 AUC, 刪除冗餘表6-11, 重編號6-12~6-18→6-11~6-17
- Nb22: feature_counts 加入 [1,2] 跑 XGB Top1/Top2 實驗
- 圖6-5: 更新含 Top1/Top2 數據點的特徵精簡圖
- Review #12: A-X md修改 + 全章 docx re-pandoc (Ch2/3/6/7/8/9/摘要/參考文獻)
- 初稿III output: 主文件 docx + PDF
- Meeting22 紀錄 + 文獻總索引 + 印刷指南更新

Co-Authored-By: Claude Opus 4.6 <noreply@anthropic.com>
</commit_message>
<xml_diff>
--- a/docs/00_thesis/chapters/00b_中文摘要.docx
+++ b/docs/00_thesis/chapters/00b_中文摘要.docx
@@ -180,7 +180,25 @@
         <w:rPr>
           <w:rFonts w:hint="eastAsia"/>
         </w:rPr>
-        <w:t xml:space="preserve">0.938；（2）Δ</w:t>
+        <w:t xml:space="preserve">0.938；（2）縱向健檢資料的累積有助於提升預測性能：健檢次數與</w:t>
+      </w:r>
+      <w:r>
+        <w:t xml:space="preserve"> AUC </w:t>
+      </w:r>
+      <w:r>
+        <w:rPr>
+          <w:rFonts w:hint="eastAsia"/>
+        </w:rPr>
+        <w:t xml:space="preserve">呈正向關係（如高血壓由</w:t>
+      </w:r>
+      <w:r>
+        <w:t xml:space="preserve"> 0.676 </w:t>
+      </w:r>
+      <w:r>
+        <w:rPr>
+          <w:rFonts w:hint="eastAsia"/>
+        </w:rPr>
+        <w:t xml:space="preserve">升至</w:t>
       </w:r>
       <w:r>
         <w:t xml:space="preserve"> </w:t>
@@ -189,16 +207,16 @@
         <w:rPr>
           <w:rFonts w:hint="eastAsia"/>
         </w:rPr>
-        <w:t xml:space="preserve">特徵可帶來</w:t>
-      </w:r>
-      <w:r>
-        <w:t xml:space="preserve"> 1.5%–2.3% </w:t>
-      </w:r>
-      <w:r>
-        <w:rPr>
-          <w:rFonts w:hint="eastAsia"/>
-        </w:rPr>
-        <w:t xml:space="preserve">的</w:t>
+        <w:t xml:space="preserve">0.835）；（3）SHAP</w:t>
+      </w:r>
+      <w:r>
+        <w:t xml:space="preserve"> (SHapley Additive exPlanations) </w:t>
+      </w:r>
+      <w:r>
+        <w:rPr>
+          <w:rFonts w:hint="eastAsia"/>
+        </w:rPr>
+        <w:t xml:space="preserve">分析揭示疾病特異性預測因子；（4）符號回歸發現極簡公式即可達到</w:t>
       </w:r>
       <w:r>
         <w:t xml:space="preserve"> AUC </w:t>
@@ -207,7 +225,7 @@
         <w:rPr>
           <w:rFonts w:hint="eastAsia"/>
         </w:rPr>
-        <w:t xml:space="preserve">提升，且在前十大重要特徵中佔比達</w:t>
+        <w:t xml:space="preserve">0.943；（5）僅用前兩大特徵，AUC</w:t>
       </w:r>
       <w:r>
         <w:t xml:space="preserve"> </w:t>
@@ -216,37 +234,16 @@
         <w:rPr>
           <w:rFonts w:hint="eastAsia"/>
         </w:rPr>
-        <w:t xml:space="preserve">30–50%；（3）SHAP</w:t>
-      </w:r>
-      <w:r>
-        <w:t xml:space="preserve"> (SHapley Additive exPlanations) </w:t>
-      </w:r>
-      <w:r>
-        <w:rPr>
-          <w:rFonts w:hint="eastAsia"/>
-        </w:rPr>
-        <w:t xml:space="preserve">分析揭示疾病特異性預測因子；（4）符號回歸發現極簡公式即可達到</w:t>
-      </w:r>
-      <w:r>
-        <w:t xml:space="preserve"> AUC </w:t>
-      </w:r>
-      <w:r>
-        <w:rPr>
-          <w:rFonts w:hint="eastAsia"/>
-        </w:rPr>
-        <w:t xml:space="preserve">0.943；（5）累積更多健檢紀錄有助於提升預測性能；（6）僅用前五大特徵，AUC</w:t>
-      </w:r>
-      <w:r>
-        <w:t xml:space="preserve"> </w:t>
-      </w:r>
-      <w:r>
-        <w:rPr>
-          <w:rFonts w:hint="eastAsia"/>
-        </w:rPr>
-        <w:t xml:space="preserve">降幅小於</w:t>
-      </w:r>
-      <w:r>
-        <w:t xml:space="preserve"> 0.5%。</w:t>
+        <w:t xml:space="preserve">降幅仍在</w:t>
+      </w:r>
+      <w:r>
+        <w:t xml:space="preserve"> 1.5% </w:t>
+      </w:r>
+      <w:r>
+        <w:rPr>
+          <w:rFonts w:hint="eastAsia"/>
+        </w:rPr>
+        <w:t xml:space="preserve">以內。</w:t>
       </w:r>
     </w:p>
     <w:p>

</xml_diff>